<commit_message>
Modified the CV and Build files
</commit_message>
<xml_diff>
--- a/assets/Dr_Victor_Agughasi_CV.docx
+++ b/assets/Dr_Victor_Agughasi_CV.docx
@@ -1906,6 +1906,32 @@
           <w:color w:val="222222"/>
           <w:sz w:val="20"/>
         </w:rPr>
+        <w:t xml:space="preserve">2026: </w:t>
+      </w:r>
+      <w:r>
+        <w:rPr>
+          <w:rFonts w:ascii="Times New Roman" w:hAnsi="Times New Roman"/>
+          <w:b w:val="0"/>
+          <w:i w:val="0"/>
+          <w:color w:val="222222"/>
+          <w:sz w:val="20"/>
+        </w:rPr>
+        <w:t>Jan 2026 ATAL FDP on "Artificial Intelligence: Insights and Applications", organized by the Department of CSE-AI.</w:t>
+      </w:r>
+    </w:p>
+    <w:p>
+      <w:pPr>
+        <w:pStyle w:val="ListBullet"/>
+        <w:spacing w:after="0" w:line="240" w:lineRule="auto"/>
+      </w:pPr>
+      <w:r>
+        <w:rPr>
+          <w:rFonts w:ascii="Times New Roman" w:hAnsi="Times New Roman"/>
+          <w:b/>
+          <w:i w:val="0"/>
+          <w:color w:val="222222"/>
+          <w:sz w:val="20"/>
+        </w:rPr>
         <w:t xml:space="preserve">2025: </w:t>
       </w:r>
       <w:r>

</xml_diff>